<commit_message>
Align the buyer page and CV on the revised target profile.
Drop turnover as a size criterion, update EBE, headcount and valuation, and present digital services as the core sector with the four passion sectors as an opening.

Co-authored-by: Guillaume CARMENT <guillaumecarment@gmail.com>
</commit_message>
<xml_diff>
--- a/p/CV_Repreneur-Guillaume_CARMENT.docx
+++ b/p/CV_Repreneur-Guillaume_CARMENT.docx
@@ -1,6 +1,6 @@
 
 <file path=word/document.xml><?xml version="1.0" encoding="utf-8"?>
-<w:document xmlns:wpc="http://schemas.microsoft.com/office/word/2010/wordprocessingCanvas" xmlns:cx="http://schemas.microsoft.com/office/drawing/2014/chartex" xmlns:cx1="http://schemas.microsoft.com/office/drawing/2015/9/8/chartex" xmlns:cx2="http://schemas.microsoft.com/office/drawing/2015/10/21/chartex" xmlns:cx3="http://schemas.microsoft.com/office/drawing/2016/5/9/chartex" xmlns:cx4="http://schemas.microsoft.com/office/drawing/2016/5/10/chartex" xmlns:cx5="http://schemas.microsoft.com/office/drawing/2016/5/11/chartex" xmlns:cx6="http://schemas.microsoft.com/office/drawing/2016/5/12/chartex" xmlns:cx7="http://schemas.microsoft.com/office/drawing/2016/5/13/chartex" xmlns:cx8="http://schemas.microsoft.com/office/drawing/2016/5/14/chartex" xmlns:mc="http://schemas.openxmlformats.org/markup-compatibility/2006" xmlns:aink="http://schemas.microsoft.com/office/drawing/2016/ink" xmlns:am3d="http://schemas.microsoft.com/office/drawing/2017/model3d" xmlns:o="urn:schemas-microsoft-com:office:office" xmlns:oel="http://schemas.microsoft.com/office/2019/extlst" xmlns:r="http://schemas.openxmlformats.org/officeDocument/2006/relationships" xmlns:m="http://schemas.openxmlformats.org/officeDocument/2006/math" xmlns:v="urn:schemas-microsoft-com:vml" xmlns:wp14="http://schemas.microsoft.com/office/word/2010/wordprocessingDrawing" xmlns:wp="http://schemas.openxmlformats.org/drawingml/2006/wordprocessingDrawing" xmlns:w10="urn:schemas-microsoft-com:office:word" xmlns:w="http://schemas.openxmlformats.org/wordprocessingml/2006/main" xmlns:w14="http://schemas.microsoft.com/office/word/2010/wordml" xmlns:w15="http://schemas.microsoft.com/office/word/2012/wordml" xmlns:w16cei="http://schemas.microsoft.com/office/word/2026/wordml/cei" xmlns:w16cex="http://schemas.microsoft.com/office/word/2018/wordml/cex" xmlns:w16cid="http://schemas.microsoft.com/office/word/2016/wordml/cid" xmlns:w16="http://schemas.microsoft.com/office/word/2018/wordml" xmlns:w16du="http://schemas.microsoft.com/office/word/2023/wordml/word16du" xmlns:w16sdtdh="http://schemas.microsoft.com/office/word/2020/wordml/sdtdatahash" xmlns:w16sdtfl="http://schemas.microsoft.com/office/word/2024/wordml/sdtformatlock" xmlns:w16se="http://schemas.microsoft.com/office/word/2015/wordml/symex" xmlns:wpg="http://schemas.microsoft.com/office/word/2010/wordprocessingGroup" xmlns:wpi="http://schemas.microsoft.com/office/word/2010/wordprocessingInk" xmlns:wne="http://schemas.microsoft.com/office/word/2006/wordml" xmlns:wps="http://schemas.microsoft.com/office/word/2010/wordprocessingShape" mc:Ignorable="w14 w15 w16se w16cid w16 w16cex w16sdtdh w16sdtfl w16du wp14">
+<w:document xmlns:a="http://schemas.openxmlformats.org/drawingml/2006/main" xmlns:a14="http://schemas.microsoft.com/office/drawing/2010/main" xmlns:mc="http://schemas.openxmlformats.org/markup-compatibility/2006" xmlns:pic="http://schemas.openxmlformats.org/drawingml/2006/picture" xmlns:r="http://schemas.openxmlformats.org/officeDocument/2006/relationships" xmlns:w="http://schemas.openxmlformats.org/wordprocessingml/2006/main" xmlns:w14="http://schemas.microsoft.com/office/word/2010/wordml" xmlns:wp="http://schemas.openxmlformats.org/drawingml/2006/wordprocessingDrawing" xmlns:wp14="http://schemas.microsoft.com/office/word/2010/wordprocessingDrawing" mc:Ignorable="w14 w15 w16se w16cid w16 w16cex w16sdtdh w16sdtfl w16du wp14">
   <w:body>
     <w:p>
       <w:pPr>
@@ -31,9 +31,9 @@
             <wp:wrapNone/>
             <wp:docPr id="1" name="image1.jpg"/>
             <wp:cNvGraphicFramePr/>
-            <a:graphic xmlns:a="http://schemas.openxmlformats.org/drawingml/2006/main">
+            <a:graphic>
               <a:graphicData uri="http://schemas.openxmlformats.org/drawingml/2006/picture">
-                <pic:pic xmlns:pic="http://schemas.openxmlformats.org/drawingml/2006/picture">
+                <pic:pic>
                   <pic:nvPicPr>
                     <pic:cNvPr id="0" name="image1.jpg"/>
                     <pic:cNvPicPr preferRelativeResize="0"/>
@@ -58,7 +58,7 @@
                     </a:ln>
                     <a:extLst>
                       <a:ext uri="{53640926-AAD7-44D8-BBD7-CCE9431645EC}">
-                        <a14:shadowObscured xmlns:a14="http://schemas.microsoft.com/office/drawing/2010/main"/>
+                        <a14:shadowObscured/>
                       </a:ext>
                     </a:extLst>
                   </pic:spPr>
@@ -433,21 +433,21 @@
                 <w:sz w:val="20"/>
                 <w:szCs w:val="20"/>
               </w:rPr>
-              <w:t xml:space="preserve">Mon ciblage sectoriel repose sur un alignement direct entre mes compétences de </w:t>
-            </w:r>
-            <w:r>
-              <w:rPr>
-                <w:sz w:val="20"/>
-                <w:szCs w:val="20"/>
-              </w:rPr>
-              <w:t>manager</w:t>
-            </w:r>
-            <w:r>
-              <w:rPr>
-                <w:sz w:val="20"/>
-                <w:szCs w:val="20"/>
-              </w:rPr>
-              <w:t xml:space="preserve"> et une connaissance intime du terrain :</w:t>
+              <w:t xml:space="preserve">Secteur cœur — services numériques et conseil B2B : direction d’agence et de l’offre chez apini (cession au groupe Extia), management jusqu’à 50 collaborateurs, conseil (stratégie SI, organisation, PMO), puis Shift Consulting et CGI. Ouverture — secteurs passion, sans exclusivité :</w:t>
+            </w:r>
+            <w:r>
+              <w:rPr>
+                <w:sz w:val="20"/>
+                <w:szCs w:val="20"/>
+              </w:rPr>
+              <w:t/>
+            </w:r>
+            <w:r>
+              <w:rPr>
+                <w:sz w:val="20"/>
+                <w:szCs w:val="20"/>
+              </w:rPr>
+              <w:t xml:space="preserve"/>
             </w:r>
           </w:p>
           <w:p>
@@ -505,7 +505,7 @@
                 <w:sz w:val="20"/>
                 <w:szCs w:val="20"/>
               </w:rPr>
-              <w:t xml:space="preserve"> Culture du concret, pratique manuelle régulière, compréhension immédiate du matériau et du sens du métier.</w:t>
+              <w:t xml:space="preserve"> pratique régulière, culture du concret et du geste.</w:t>
             </w:r>
           </w:p>
           <w:p>
@@ -553,7 +553,7 @@
                 <w:sz w:val="20"/>
                 <w:szCs w:val="20"/>
               </w:rPr>
-              <w:t xml:space="preserve"> Maîtrise globale des écosystèmes et technologies du marché (B2C/B2B), évaluation rapide du potentiel d'innovation.</w:t>
+              <w:t xml:space="preserve"> usage et veille des solutions Smart Home (B2C/B2B).</w:t>
             </w:r>
           </w:p>
           <w:p>
@@ -594,14 +594,14 @@
                 <w:sz w:val="20"/>
                 <w:szCs w:val="20"/>
               </w:rPr>
-              <w:t>(équipementiers, événementiel) :</w:t>
-            </w:r>
-            <w:r>
-              <w:rPr>
-                <w:sz w:val="20"/>
-                <w:szCs w:val="20"/>
-              </w:rPr>
-              <w:t xml:space="preserve"> Pratique sportive soutenue et veille constante apportant une vision claire des attentes d'utilisateurs exigeants.</w:t>
+              <w:t>:</w:t>
+            </w:r>
+            <w:r>
+              <w:rPr>
+                <w:sz w:val="20"/>
+                <w:szCs w:val="20"/>
+              </w:rPr>
+              <w:t xml:space="preserve"> pratique (voile, vélo, wingfoil) et regard d’utilisateur.</w:t>
             </w:r>
           </w:p>
           <w:p>
@@ -673,7 +673,7 @@
                 <w:sz w:val="20"/>
                 <w:szCs w:val="20"/>
               </w:rPr>
-              <w:t>Attiré par les défis d'optimisation et d'innovation des parcours de production. Mon esprit ingénieux et structuré s'épanouit dans la résolution de problématiques industrielles concrètes.</w:t>
+              <w:t xml:space="preserve"> optimisation et innovation des parcours de production.</w:t>
             </w:r>
           </w:p>
           <w:p>
@@ -796,49 +796,49 @@
                 <w:sz w:val="20"/>
                 <w:szCs w:val="20"/>
               </w:rPr>
-              <w:t xml:space="preserve"> | CA de </w:t>
-            </w:r>
-            <w:r>
-              <w:rPr>
-                <w:sz w:val="20"/>
-                <w:szCs w:val="20"/>
-              </w:rPr>
-              <w:t>800</w:t>
-            </w:r>
-            <w:r>
-              <w:rPr>
-                <w:sz w:val="20"/>
-                <w:szCs w:val="20"/>
-              </w:rPr>
-              <w:t xml:space="preserve"> </w:t>
-            </w:r>
-            <w:r>
-              <w:rPr>
-                <w:sz w:val="20"/>
-                <w:szCs w:val="20"/>
-              </w:rPr>
-              <w:t>K</w:t>
-            </w:r>
-            <w:r>
-              <w:rPr>
-                <w:sz w:val="20"/>
-                <w:szCs w:val="20"/>
-              </w:rPr>
-              <w:t xml:space="preserve">€ à </w:t>
-            </w:r>
-            <w:r>
-              <w:rPr>
-                <w:sz w:val="20"/>
-                <w:szCs w:val="20"/>
-              </w:rPr>
-              <w:t>2,5</w:t>
-            </w:r>
-            <w:r>
-              <w:rPr>
-                <w:sz w:val="20"/>
-                <w:szCs w:val="20"/>
-              </w:rPr>
-              <w:t xml:space="preserve"> M€ | In bonis, à développer | ~10 collaborateurs (équipe autonome).</w:t>
+              <w:t xml:space="preserve"> | In bonis, à développer | EBE entre 250 K€ et 800 K€ | entre 10 et 50 salariés.</w:t>
+            </w:r>
+            <w:r>
+              <w:rPr>
+                <w:sz w:val="20"/>
+                <w:szCs w:val="20"/>
+              </w:rPr>
+              <w:t/>
+            </w:r>
+            <w:r>
+              <w:rPr>
+                <w:sz w:val="20"/>
+                <w:szCs w:val="20"/>
+              </w:rPr>
+              <w:t xml:space="preserve"/>
+            </w:r>
+            <w:r>
+              <w:rPr>
+                <w:sz w:val="20"/>
+                <w:szCs w:val="20"/>
+              </w:rPr>
+              <w:t/>
+            </w:r>
+            <w:r>
+              <w:rPr>
+                <w:sz w:val="20"/>
+                <w:szCs w:val="20"/>
+              </w:rPr>
+              <w:t xml:space="preserve"/>
+            </w:r>
+            <w:r>
+              <w:rPr>
+                <w:sz w:val="20"/>
+                <w:szCs w:val="20"/>
+              </w:rPr>
+              <w:t/>
+            </w:r>
+            <w:r>
+              <w:rPr>
+                <w:sz w:val="20"/>
+                <w:szCs w:val="20"/>
+              </w:rPr>
+              <w:t xml:space="preserve"/>
             </w:r>
           </w:p>
           <w:p>
@@ -893,7 +893,7 @@
                 <w:sz w:val="20"/>
                 <w:szCs w:val="20"/>
               </w:rPr>
-              <w:t>CA stable, plusieurs années d’expérience, récurrence contractuelle sur une part du CA</w:t>
+              <w:t>Plusieurs années d’expérience, récurrence contractuelle sur une partie de l’activité</w:t>
             </w:r>
           </w:p>
         </w:tc>
@@ -982,81 +982,7 @@
                 <w:sz w:val="20"/>
                 <w:szCs w:val="20"/>
               </w:rPr>
-              <w:t>Valorisation ciblée :</w:t>
-            </w:r>
-          </w:p>
-          <w:p>
-            <w:pPr>
-              <w:pStyle w:val="Paragraphedeliste"/>
-              <w:numPr>
-                <w:ilvl w:val="0"/>
-                <w:numId w:val="6"/>
-              </w:numPr>
-              <w:pBdr>
-                <w:top w:val="nil"/>
-                <w:left w:val="nil"/>
-                <w:bottom w:val="nil"/>
-                <w:right w:val="nil"/>
-                <w:between w:val="nil"/>
-              </w:pBdr>
-              <w:ind w:left="505"/>
-              <w:rPr>
-                <w:sz w:val="20"/>
-                <w:szCs w:val="20"/>
-              </w:rPr>
-            </w:pPr>
-            <w:r>
-              <w:rPr>
-                <w:b/>
-                <w:bCs/>
-                <w:sz w:val="20"/>
-                <w:szCs w:val="20"/>
-              </w:rPr>
-              <w:t>Cible privilégiée</w:t>
-            </w:r>
-            <w:r>
-              <w:rPr>
-                <w:sz w:val="20"/>
-                <w:szCs w:val="20"/>
-              </w:rPr>
-              <w:t xml:space="preserve"> (Solo) : 400 K€ à 800 K€ (leviers classiques et prêts d'honneur).</w:t>
-            </w:r>
-          </w:p>
-          <w:p>
-            <w:pPr>
-              <w:pStyle w:val="Paragraphedeliste"/>
-              <w:numPr>
-                <w:ilvl w:val="0"/>
-                <w:numId w:val="6"/>
-              </w:numPr>
-              <w:pBdr>
-                <w:top w:val="nil"/>
-                <w:left w:val="nil"/>
-                <w:bottom w:val="nil"/>
-                <w:right w:val="nil"/>
-                <w:between w:val="nil"/>
-              </w:pBdr>
-              <w:ind w:left="505"/>
-              <w:rPr>
-                <w:sz w:val="20"/>
-                <w:szCs w:val="20"/>
-              </w:rPr>
-            </w:pPr>
-            <w:r>
-              <w:rPr>
-                <w:b/>
-                <w:bCs/>
-                <w:sz w:val="20"/>
-                <w:szCs w:val="20"/>
-              </w:rPr>
-              <w:t>Cible opportuniste</w:t>
-            </w:r>
-            <w:r>
-              <w:rPr>
-                <w:sz w:val="20"/>
-                <w:szCs w:val="20"/>
-              </w:rPr>
-              <w:t xml:space="preserve"> (jusqu'à 1,5 M€) : Capacité à structurer un LBI avec syndication d'un pool de Business Angels mobilisables.</w:t>
+              <w:t>Valorisation cible : entre 1 M€ et 4 M€</w:t>
             </w:r>
           </w:p>
           <w:p>
@@ -1087,21 +1013,21 @@
                 <w:sz w:val="20"/>
                 <w:szCs w:val="20"/>
               </w:rPr>
-              <w:t xml:space="preserve"> 100 </w:t>
-            </w:r>
-            <w:r>
-              <w:rPr>
-                <w:sz w:val="20"/>
-                <w:szCs w:val="20"/>
-              </w:rPr>
-              <w:t>K</w:t>
-            </w:r>
-            <w:r>
-              <w:rPr>
-                <w:sz w:val="20"/>
-                <w:szCs w:val="20"/>
-              </w:rPr>
-              <w:t xml:space="preserve">€ (fonds propres) </w:t>
+              <w:t xml:space="preserve"> entre 300 K€ et 500 K€ (fonds propres)</w:t>
+            </w:r>
+            <w:r>
+              <w:rPr>
+                <w:sz w:val="20"/>
+                <w:szCs w:val="20"/>
+              </w:rPr>
+              <w:t/>
+            </w:r>
+            <w:r>
+              <w:rPr>
+                <w:sz w:val="20"/>
+                <w:szCs w:val="20"/>
+              </w:rPr>
+              <w:t xml:space="preserve"/>
             </w:r>
           </w:p>
           <w:p>
@@ -1177,14 +1103,14 @@
                 <w:sz w:val="20"/>
                 <w:szCs w:val="20"/>
               </w:rPr>
-              <w:t xml:space="preserve">Selon la cible - </w:t>
-            </w:r>
-            <w:r>
-              <w:rPr>
-                <w:sz w:val="20"/>
-                <w:szCs w:val="20"/>
-              </w:rPr>
-              <w:t>Emprunt bancaire + Crédit vendeur.</w:t>
+              <w:t xml:space="preserve">LBO / LBI, structuré autour des fonds propres, des prêts d’honneur et de l’emprunt bancaire senior.</w:t>
+            </w:r>
+            <w:r>
+              <w:rPr>
+                <w:sz w:val="20"/>
+                <w:szCs w:val="20"/>
+              </w:rPr>
+              <w:t/>
             </w:r>
           </w:p>
         </w:tc>
@@ -1310,42 +1236,42 @@
                 <w:sz w:val="20"/>
                 <w:szCs w:val="20"/>
               </w:rPr>
-              <w:t>Équipe :</w:t>
-            </w:r>
-            <w:r>
-              <w:rPr>
-                <w:sz w:val="20"/>
-                <w:szCs w:val="20"/>
-              </w:rPr>
-              <w:t xml:space="preserve"> Cabinet d’expertise comptable et d’avocat, Conseiller </w:t>
-            </w:r>
-            <w:r>
-              <w:rPr>
-                <w:sz w:val="20"/>
-                <w:szCs w:val="20"/>
-              </w:rPr>
-              <w:t>C</w:t>
-            </w:r>
-            <w:r>
-              <w:rPr>
-                <w:sz w:val="20"/>
-                <w:szCs w:val="20"/>
-              </w:rPr>
-              <w:t>C</w:t>
-            </w:r>
-            <w:r>
-              <w:rPr>
-                <w:sz w:val="20"/>
-                <w:szCs w:val="20"/>
-              </w:rPr>
-              <w:t>RA</w:t>
-            </w:r>
-            <w:r>
-              <w:rPr>
-                <w:sz w:val="20"/>
-                <w:szCs w:val="20"/>
-              </w:rPr>
-              <w:t>.</w:t>
+              <w:t>Équipe de conseils : cabinet d’expertise comptable et d’avocat, réseau CRA / CCRE. Une équipe de repreneurs déjà identifiée.</w:t>
+            </w:r>
+            <w:r>
+              <w:rPr>
+                <w:sz w:val="20"/>
+                <w:szCs w:val="20"/>
+              </w:rPr>
+              <w:t xml:space="preserve"/>
+            </w:r>
+            <w:r>
+              <w:rPr>
+                <w:sz w:val="20"/>
+                <w:szCs w:val="20"/>
+              </w:rPr>
+              <w:t/>
+            </w:r>
+            <w:r>
+              <w:rPr>
+                <w:sz w:val="20"/>
+                <w:szCs w:val="20"/>
+              </w:rPr>
+              <w:t/>
+            </w:r>
+            <w:r>
+              <w:rPr>
+                <w:sz w:val="20"/>
+                <w:szCs w:val="20"/>
+              </w:rPr>
+              <w:t/>
+            </w:r>
+            <w:r>
+              <w:rPr>
+                <w:sz w:val="20"/>
+                <w:szCs w:val="20"/>
+              </w:rPr>
+              <w:t/>
             </w:r>
           </w:p>
         </w:tc>
@@ -1521,7 +1447,7 @@
           <w:sz w:val="20"/>
           <w:szCs w:val="20"/>
         </w:rPr>
-        <w:t xml:space="preserve"> Formation CCRA EM Lyon (Reprise d'entreprise) | Mastère Spécialisé Management et Développement des SI (EM Lyon/Centrale - 2008) | Diplôme Marketing et Management Européen (IDRAC - 2004).</w:t>
+        <w:t xml:space="preserve"> formation CCRE — Club des Créateurs et Repreneurs d’Entreprise de l’EM Lyon | Mastère Spécialisé Management et Développement des SI (EM Lyon/Centrale - 2008) | Diplôme Marketing et Management Européen (IDRAC - 2004).</w:t>
       </w:r>
     </w:p>
     <w:p>

</xml_diff>

<commit_message>
Position the buyer as a trade-SME operator, not a consulting firm.
Rewrite the contribution block so a seller sees continuity, a concrete modernization lever, and the type of company being sought.

Co-authored-by: Guillaume CARMENT <guillaumecarment@gmail.com>
</commit_message>
<xml_diff>
--- a/p/CV_Repreneur-Guillaume_CARMENT.docx
+++ b/p/CV_Repreneur-Guillaume_CARMENT.docx
@@ -394,7 +394,7 @@
                 <w:sz w:val="20"/>
                 <w:szCs w:val="20"/>
               </w:rPr>
-              <w:t>Secteurs visés</w:t>
+              <w:t>Mon apport</w:t>
             </w:r>
           </w:p>
         </w:tc>
@@ -433,7 +433,7 @@
                 <w:sz w:val="20"/>
                 <w:szCs w:val="20"/>
               </w:rPr>
-              <w:t xml:space="preserve">Secteur principal — services numériques et conseil B2B. J’ai accompagné des clients de toutes tailles : Renault Trucks, EDF, Veolia, Frenehard &amp; Michaud, des mairies, des départements et des régions. À chaque mission, il fallait apprendre vite leur métier pour être utile en systèmes d’information : processus, outils, formation, accompagnement au changement, audit. Je souhaite apporter cette expérience dans l’entreprise que je reprendrai. Parcours : CGI Business Consulting, Shift Consulting, agence lyonnaise d’apini (conseil SI, organisation, PMO), cession au groupe Extia. Ouverture — secteurs passion, sans exclusivité :</w:t>
+              <w:t xml:space="preserve">Ce que j’apporte. Je cherche une PME de métier, pas une société de conseil : industrie, services B2B, distribution ou bâtiment, savoir-faire en place, outils et organisation à faire progresser. J’entre dans le métier des équipes avant d’agir : processus, outils, formation, accompagnement, après un état des lieux. Clients et salariés d’abord. Vingt ans : Renault Trucks, EDF, Veolia, Frenehard &amp; Michaud, mairies, départements, régions. Agence lyonnaise d’apini (jusqu’à 50 personnes, P&amp;L), cession à Extia ; avant, CGI Business Consulting et Shift Consulting. Ouverture — métiers que je pratique, sans exclusivité :</w:t>
             </w:r>
             <w:r>
               <w:rPr>

</xml_diff>

<commit_message>
Name industry and B2B services as the principal sector.
Drop the trade-SME label and the exclusion of consulting firms, and lead with the sector, the hook, and the target company.

Co-authored-by: Guillaume CARMENT <guillaumecarment@gmail.com>
</commit_message>
<xml_diff>
--- a/p/CV_Repreneur-Guillaume_CARMENT.docx
+++ b/p/CV_Repreneur-Guillaume_CARMENT.docx
@@ -394,7 +394,7 @@
                 <w:sz w:val="20"/>
                 <w:szCs w:val="20"/>
               </w:rPr>
-              <w:t>Mon apport</w:t>
+              <w:t>Secteur principal</w:t>
             </w:r>
           </w:p>
         </w:tc>
@@ -433,7 +433,7 @@
                 <w:sz w:val="20"/>
                 <w:szCs w:val="20"/>
               </w:rPr>
-              <w:t xml:space="preserve">Ce que j’apporte. Je cherche une PME de métier, pas une société de conseil : industrie, services B2B, distribution ou bâtiment, savoir-faire en place, outils et organisation à faire progresser. J’entre dans le métier des équipes avant d’agir : processus, outils, formation, accompagnement, après un état des lieux. Clients et salariés d’abord. Vingt ans : Renault Trucks, EDF, Veolia, Frenehard &amp; Michaud, mairies, départements, régions. Agence lyonnaise d’apini (jusqu’à 50 personnes, P&amp;L), cession à Extia ; avant, CGI Business Consulting et Shift Consulting. Ouverture — métiers que je pratique, sans exclusivité :</w:t>
+              <w:t xml:space="preserve">Secteur principal — Industrie et services B2B. Vingt ans à apprendre le métier des autres : je les mets au service d’une PME. PME industrielles ou de services aux entreprises, au savoir-faire reconnu, dont l’organisation et les outils peuvent encore progresser. Entrer vite dans le métier des équipes, avant de changer quoi que ce soit. Simplifier les processus et les outils, former et accompagner. État des lieux d’abord, agir ensuite. Clients et salariés au centre. Renault Trucks, EDF, Veolia, Frenehard &amp; Michaud ; mairies, départements, régions. Apini Lyon, jusqu’à 50 personnes et le P&amp;L, cession à Extia ; CGI Business Consulting, Shift Consulting. Ouverture — métiers que je pratique, sans exclusivité :</w:t>
             </w:r>
             <w:r>
               <w:rPr>

</xml_diff>

<commit_message>
Add the commercial role and tighten the CV sector block.
Put industry and B2B services in the same orange as the other sectors, break the CV lines as requested, and name the buyer as the company's first salesperson.

Co-authored-by: Guillaume CARMENT <guillaumecarment@gmail.com>
</commit_message>
<xml_diff>
--- a/p/CV_Repreneur-Guillaume_CARMENT.docx
+++ b/p/CV_Repreneur-Guillaume_CARMENT.docx
@@ -433,7 +433,66 @@
                 <w:sz w:val="20"/>
                 <w:szCs w:val="20"/>
               </w:rPr>
-              <w:t xml:space="preserve">Secteur principal — Industrie et services B2B. Vingt ans à apprendre le métier des autres : je les mets au service d’une PME. PME industrielles ou de services aux entreprises, au savoir-faire reconnu, dont l’organisation et les outils peuvent encore progresser. Mon apport : comprendre d’abord le métier et les équipes, puis simplifier les processus, installer les outils utiles, former et accompagner, en préservant la continuité pour les clients et les salariés. Vingt ans de conseil : Renault Trucks, EDF, Veolia, Frenehard &amp; Michaud ; mairies, départements, régions. Apini Lyon, jusqu’à 50 personnes et le P&amp;L, cession à Extia ; CGI Business Consulting, Shift Consulting. Alternatives passions :</w:t>
+              <w:t xml:space="preserve">Secteur principal — </w:t>
+            </w:r>
+            <w:r>
+              <w:rPr>
+                <w:b/>
+                <w:bCs/>
+                <w:color w:val="EA580C"/>
+                <w:sz w:val="20"/>
+                <w:szCs w:val="20"/>
+              </w:rPr>
+              <w:t>Industrie et services B2B</w:t>
+            </w:r>
+            <w:r>
+              <w:rPr>
+                <w:sz w:val="20"/>
+                <w:szCs w:val="20"/>
+              </w:rPr>
+              <w:t>. Vingt ans à apprendre le métier des autres : je les mets au service d’une PME.</w:t>
+            </w:r>
+            <w:r>
+              <w:rPr>
+                <w:sz w:val="20"/>
+                <w:szCs w:val="20"/>
+              </w:rPr>
+              <w:br/>
+            </w:r>
+            <w:r>
+              <w:rPr>
+                <w:sz w:val="20"/>
+                <w:szCs w:val="20"/>
+              </w:rPr>
+              <w:t>PME industrielles ou de services aux entreprises, au savoir-faire reconnu, dont l’organisation et les outils peuvent encore progresser.</w:t>
+            </w:r>
+            <w:r>
+              <w:rPr>
+                <w:sz w:val="20"/>
+                <w:szCs w:val="20"/>
+              </w:rPr>
+              <w:br/>
+            </w:r>
+            <w:r>
+              <w:rPr>
+                <w:sz w:val="20"/>
+                <w:szCs w:val="20"/>
+              </w:rPr>
+              <w:t>Mon apport : comprendre d’abord le métier et les équipes, porter le développement commercial en premier commercial de l’entreprise, puis simplifier les processus, installer les outils utiles, former et accompagner, en préservant la continuité pour les clients et les salariés.</w:t>
+            </w:r>
+            <w:r>
+              <w:rPr>
+                <w:sz w:val="20"/>
+                <w:szCs w:val="20"/>
+              </w:rPr>
+              <w:br/>
+            </w:r>
+            <w:r>
+              <w:rPr>
+                <w:sz w:val="20"/>
+                <w:szCs w:val="20"/>
+              </w:rPr>
+              <w:t>Alternatives passions :</w:t>
             </w:r>
             <w:r>
               <w:rPr>
@@ -1283,8 +1342,8 @@
           <w:b/>
           <w:bCs/>
           <w:color w:val="1E293B"/>
-          <w:sz w:val="36"/>
-          <w:szCs w:val="36"/>
+          <w:sz w:val="2"/>
+          <w:szCs w:val="2"/>
         </w:rPr>
       </w:pPr>
       <w:r>

</xml_diff>

<commit_message>
State the buyer as sole leader and plain-language the profile.
Replace the team line, the action pitch, and the transition wording, rename the affinity sectors, and drop consulting acronyms from the page and the CV.

Co-authored-by: Guillaume CARMENT <guillaumecarment@gmail.com>
</commit_message>
<xml_diff>
--- a/p/CV_Repreneur-Guillaume_CARMENT.docx
+++ b/p/CV_Repreneur-Guillaume_CARMENT.docx
@@ -492,7 +492,7 @@
                 <w:sz w:val="20"/>
                 <w:szCs w:val="20"/>
               </w:rPr>
-              <w:t>Alternatives passions :</w:t>
+              <w:t>Secteurs d’affinité :</w:t>
             </w:r>
             <w:r>
               <w:rPr>
@@ -538,7 +538,7 @@
                 <w:sz w:val="20"/>
                 <w:szCs w:val="20"/>
               </w:rPr>
-              <w:t>Le Bois</w:t>
+              <w:t>Filière bois</w:t>
             </w:r>
             <w:r>
               <w:rPr>
@@ -564,7 +564,7 @@
                 <w:sz w:val="20"/>
                 <w:szCs w:val="20"/>
               </w:rPr>
-              <w:t xml:space="preserve"> pratique régulière, culture du concret et du geste.</w:t>
+              <w:t xml:space="preserve"> connaissance concrète du matériau et des enjeux de fabrication, de l’artisanat à la série.</w:t>
             </w:r>
           </w:p>
           <w:p>
@@ -596,7 +596,7 @@
                 <w:sz w:val="20"/>
                 <w:szCs w:val="20"/>
               </w:rPr>
-              <w:t xml:space="preserve">La Domotique </w:t>
+              <w:t xml:space="preserve">Domotique </w:t>
             </w:r>
             <w:r>
               <w:rPr>
@@ -612,7 +612,7 @@
                 <w:sz w:val="20"/>
                 <w:szCs w:val="20"/>
               </w:rPr>
-              <w:t xml:space="preserve"> usage et veille des solutions Smart Home (B2C/B2B).</w:t>
+              <w:t xml:space="preserve"> bâtiment connecté et solutions smart home (B2B/B2C), installation et services.</w:t>
             </w:r>
           </w:p>
           <w:p>
@@ -644,7 +644,7 @@
                 <w:sz w:val="20"/>
                 <w:szCs w:val="20"/>
               </w:rPr>
-              <w:t xml:space="preserve">Le Sport </w:t>
+              <w:t xml:space="preserve">Sport </w:t>
             </w:r>
             <w:r>
               <w:rPr>
@@ -660,7 +660,7 @@
                 <w:sz w:val="20"/>
                 <w:szCs w:val="20"/>
               </w:rPr>
-              <w:t xml:space="preserve"> pratique (voile, vélo, wingfoil) et regard d’utilisateur.</w:t>
+              <w:t xml:space="preserve"> équipements et services sportifs, regard d’utilisateur exigeant.</w:t>
             </w:r>
           </w:p>
           <w:p>
@@ -692,7 +692,7 @@
                 <w:sz w:val="20"/>
                 <w:szCs w:val="20"/>
               </w:rPr>
-              <w:t>L</w:t>
+              <w:t>Industrie</w:t>
             </w:r>
             <w:r>
               <w:rPr>
@@ -702,7 +702,7 @@
                 <w:sz w:val="20"/>
                 <w:szCs w:val="20"/>
               </w:rPr>
-              <w:t>’industrie</w:t>
+              <w:t/>
             </w:r>
             <w:r>
               <w:rPr>
@@ -732,7 +732,7 @@
                 <w:sz w:val="20"/>
                 <w:szCs w:val="20"/>
               </w:rPr>
-              <w:t xml:space="preserve"> optimisation et innovation des parcours de production.</w:t>
+              <w:t xml:space="preserve">organisation de la production et amélioration continue.</w:t>
             </w:r>
           </w:p>
           <w:p>
@@ -1256,21 +1256,21 @@
                 <w:sz w:val="20"/>
                 <w:szCs w:val="20"/>
               </w:rPr>
-              <w:t xml:space="preserve">Prise de participation majoritaire ou totale | Accompagnement court </w:t>
-            </w:r>
-            <w:r>
-              <w:rPr>
-                <w:sz w:val="20"/>
-                <w:szCs w:val="20"/>
-              </w:rPr>
-              <w:t xml:space="preserve">(3 à 6 mois) </w:t>
-            </w:r>
-            <w:r>
-              <w:rPr>
-                <w:sz w:val="20"/>
-                <w:szCs w:val="20"/>
-              </w:rPr>
-              <w:t>par le cédant.</w:t>
+              <w:t xml:space="preserve">Prise de participation majoritaire ou totale | Transition accompagnée avec le cédant (idéalement 3 à 6 mois, à adapter selon les besoins de l’entreprise et du cédant).</w:t>
+            </w:r>
+            <w:r>
+              <w:rPr>
+                <w:sz w:val="20"/>
+                <w:szCs w:val="20"/>
+              </w:rPr>
+              <w:t xml:space="preserve"/>
+            </w:r>
+            <w:r>
+              <w:rPr>
+                <w:sz w:val="20"/>
+                <w:szCs w:val="20"/>
+              </w:rPr>
+              <w:t/>
             </w:r>
           </w:p>
           <w:p>
@@ -1295,7 +1295,7 @@
                 <w:sz w:val="20"/>
                 <w:szCs w:val="20"/>
               </w:rPr>
-              <w:t>Équipe de conseils : cabinet d’expertise comptable et d’avocat, réseau CRA / CCRE. Une équipe de repreneurs déjà identifiée.</w:t>
+              <w:t>Équipe de conseils : cabinet d’expertise comptable et d’avocat, réseau CRA / CCRE. Je reprendrai l’entreprise en tant que dirigeant, accompagné d’associés financiers déjà identifiés.</w:t>
             </w:r>
             <w:r>
               <w:rPr>
@@ -1397,7 +1397,7 @@
           <w:sz w:val="20"/>
           <w:szCs w:val="20"/>
         </w:rPr>
-        <w:t xml:space="preserve"> Ouverture et pilotage d'agence, gestion complète de P&amp;L (jusqu'à 2 M€).</w:t>
+        <w:t xml:space="preserve"> Ouverture et pilotage d'agence, gestion complète du compte de résultat (jusqu'à 2 M€).</w:t>
       </w:r>
     </w:p>
     <w:p>
@@ -1421,14 +1421,14 @@
           <w:sz w:val="20"/>
           <w:szCs w:val="20"/>
         </w:rPr>
-        <w:t>Management &amp; Orga :</w:t>
+        <w:t>Management et organisation :</w:t>
       </w:r>
       <w:r>
         <w:rPr>
           <w:sz w:val="20"/>
           <w:szCs w:val="20"/>
         </w:rPr>
-        <w:t xml:space="preserve"> Direction d'équipes pluridisciplinaires (jusqu'à 50 coll.), Pilotage de la stratégie (SI, PMO, conduite du changement).</w:t>
+        <w:t xml:space="preserve"> Direction d’équipes pluridisciplinaires (jusqu’à 50 collaborateurs), pilotage de l’organisation, des systèmes d’information et des projets.</w:t>
       </w:r>
     </w:p>
     <w:p>
@@ -1467,7 +1467,7 @@
           <w:sz w:val="20"/>
           <w:szCs w:val="20"/>
         </w:rPr>
-        <w:t>BtoB</w:t>
+        <w:t>auprès des entreprises</w:t>
       </w:r>
       <w:proofErr w:type="spellEnd"/>
       <w:r>
@@ -1475,7 +1475,7 @@
           <w:sz w:val="20"/>
           <w:szCs w:val="20"/>
         </w:rPr>
-        <w:t>/BtoC, prospection, réponse aux appels d'offres, fidélisation de clients.</w:t>
+        <w:t xml:space="preserve"> et des particuliers, prospection, réponse aux appels d'offres, fidélisation de clients.</w:t>
       </w:r>
     </w:p>
     <w:p>
@@ -1506,7 +1506,7 @@
           <w:sz w:val="20"/>
           <w:szCs w:val="20"/>
         </w:rPr>
-        <w:t xml:space="preserve"> formation CCRE — Club des Créateurs et Repreneurs d’Entreprise de l’EM Lyon | Mastère Spécialisé Management et Développement des SI (EM Lyon/Centrale - 2008) | Diplôme Marketing et Management Européen (IDRAC - 2004).</w:t>
+        <w:t xml:space="preserve"> formation CCRE — Club des Créateurs et Repreneurs d’Entreprise de l’EM Lyon | Mastère spécialisé Management et développement des systèmes d’information (EM Lyon/Centrale - 2008) | Diplôme Marketing et Management Européen (IDRAC - 2004).</w:t>
       </w:r>
     </w:p>
     <w:p>
@@ -1608,7 +1608,7 @@
         <w:t>Missions :</w:t>
       </w:r>
       <w:r>
-        <w:t xml:space="preserve"> Ouverture de l'agence lyonnaise, gestion du P&amp;L, recrutement et management (jusqu'à 50 collaborateurs). Développement de la stratégie commerciale, réponse aux appels d'offres (public et privé). Pilotage de l’offre conseil au niveau national.</w:t>
+        <w:t xml:space="preserve"> Ouverture de l'agence lyonnaise, gestion du compte de résultat, recrutement et management (jusqu'à 50 collaborateurs). Développement de la stratégie commerciale, réponse aux appels d'offres (public et privé). Pilotage de l’offre conseil au niveau national.</w:t>
       </w:r>
     </w:p>
     <w:p>
@@ -1641,7 +1641,7 @@
       </w:r>
       <w:proofErr w:type="spellEnd"/>
       <w:r>
-        <w:t>). Structuration des offres de conseil (Stratégie SI, Organisation, PMO).</w:t>
+        <w:t>). Structuration des offres de conseil : stratégie des systèmes d’information, organisation et pilotage de projets.</w:t>
       </w:r>
     </w:p>
     <w:p>
@@ -1699,7 +1699,7 @@
         <w:t>Missions :</w:t>
       </w:r>
       <w:r>
-        <w:t xml:space="preserve"> Prospection, développement commercial et gestion d'un P&amp;L (2 M€).</w:t>
+        <w:t xml:space="preserve"> Prospection, développement commercial et gestion d’un compte de résultat (2 M€).</w:t>
       </w:r>
     </w:p>
     <w:p>
@@ -1764,7 +1764,7 @@
         <w:t>Missions :</w:t>
       </w:r>
       <w:r>
-        <w:t xml:space="preserve"> Accompagnement stratégique, AMOE et AMOA pour de grands comptes.</w:t>
+        <w:t xml:space="preserve"> Accompagnement stratégique et pilotage de grands projets informatiques et organisationnels pour de grands comptes.</w:t>
       </w:r>
     </w:p>
     <w:p>
@@ -1789,7 +1789,7 @@
         <w:t>Réalisations :</w:t>
       </w:r>
       <w:r>
-        <w:t xml:space="preserve"> Mise en place d'outils de gestion de portefeuilles de projets (PPM) pour EDF. Pilotage de la stratégie documentaire pour Renault Trucks.</w:t>
+        <w:t xml:space="preserve"> Mise en place d’outils de pilotage de l’activité pour EDF. Suivi documentaire des projets pour Renault Trucks.</w:t>
       </w:r>
     </w:p>
     <w:p>
@@ -1854,12 +1854,12 @@
         <w:t>Réalisations :</w:t>
       </w:r>
       <w:r>
-        <w:t xml:space="preserve"> Suivi financier (P&amp;L). Création et gestion du système d'information complet pour les 40 agences de la franchise.</w:t>
+        <w:t xml:space="preserve"> Suivi du compte de résultat. Création et gestion du système d'information complet pour les 40 agences de la franchise.</w:t>
       </w:r>
     </w:p>
     <w:sectPr>
       <w:pgSz w:w="12240" w:h="15840"/>
-      <w:pgMar w:top="1134" w:right="1077" w:bottom="1134" w:left="1077" w:header="0" w:footer="720" w:gutter="0"/>
+      <w:pgMar w:top="860" w:right="1077" w:bottom="700" w:left="1077" w:header="0" w:footer="0" w:gutter="0"/>
       <w:pgNumType w:start="1"/>
       <w:cols w:space="720"/>
       <w:docGrid w:linePitch="299"/>

</xml_diff>

<commit_message>
State the buyer as sole leader and plain-language the profile. (#2)
Replace the team line, the action pitch, and the transition wording, rename the affinity sectors, and drop consulting acronyms from the page and the CV.

Co-authored-by: Cursor Agent <cursoragent@cursor.com>
</commit_message>
<xml_diff>
--- a/p/CV_Repreneur-Guillaume_CARMENT.docx
+++ b/p/CV_Repreneur-Guillaume_CARMENT.docx
@@ -492,7 +492,7 @@
                 <w:sz w:val="20"/>
                 <w:szCs w:val="20"/>
               </w:rPr>
-              <w:t>Alternatives passions :</w:t>
+              <w:t>Secteurs d’affinité :</w:t>
             </w:r>
             <w:r>
               <w:rPr>
@@ -538,7 +538,7 @@
                 <w:sz w:val="20"/>
                 <w:szCs w:val="20"/>
               </w:rPr>
-              <w:t>Le Bois</w:t>
+              <w:t>Filière bois</w:t>
             </w:r>
             <w:r>
               <w:rPr>
@@ -564,7 +564,7 @@
                 <w:sz w:val="20"/>
                 <w:szCs w:val="20"/>
               </w:rPr>
-              <w:t xml:space="preserve"> pratique régulière, culture du concret et du geste.</w:t>
+              <w:t xml:space="preserve"> connaissance concrète du matériau et des enjeux de fabrication, de l’artisanat à la série.</w:t>
             </w:r>
           </w:p>
           <w:p>
@@ -596,7 +596,7 @@
                 <w:sz w:val="20"/>
                 <w:szCs w:val="20"/>
               </w:rPr>
-              <w:t xml:space="preserve">La Domotique </w:t>
+              <w:t xml:space="preserve">Domotique </w:t>
             </w:r>
             <w:r>
               <w:rPr>
@@ -612,7 +612,7 @@
                 <w:sz w:val="20"/>
                 <w:szCs w:val="20"/>
               </w:rPr>
-              <w:t xml:space="preserve"> usage et veille des solutions Smart Home (B2C/B2B).</w:t>
+              <w:t xml:space="preserve"> bâtiment connecté et solutions smart home (B2B/B2C), installation et services.</w:t>
             </w:r>
           </w:p>
           <w:p>
@@ -644,7 +644,7 @@
                 <w:sz w:val="20"/>
                 <w:szCs w:val="20"/>
               </w:rPr>
-              <w:t xml:space="preserve">Le Sport </w:t>
+              <w:t xml:space="preserve">Sport </w:t>
             </w:r>
             <w:r>
               <w:rPr>
@@ -660,7 +660,7 @@
                 <w:sz w:val="20"/>
                 <w:szCs w:val="20"/>
               </w:rPr>
-              <w:t xml:space="preserve"> pratique (voile, vélo, wingfoil) et regard d’utilisateur.</w:t>
+              <w:t xml:space="preserve"> équipements et services sportifs, regard d’utilisateur exigeant.</w:t>
             </w:r>
           </w:p>
           <w:p>
@@ -692,7 +692,7 @@
                 <w:sz w:val="20"/>
                 <w:szCs w:val="20"/>
               </w:rPr>
-              <w:t>L</w:t>
+              <w:t>Industrie</w:t>
             </w:r>
             <w:r>
               <w:rPr>
@@ -702,7 +702,7 @@
                 <w:sz w:val="20"/>
                 <w:szCs w:val="20"/>
               </w:rPr>
-              <w:t>’industrie</w:t>
+              <w:t/>
             </w:r>
             <w:r>
               <w:rPr>
@@ -732,7 +732,7 @@
                 <w:sz w:val="20"/>
                 <w:szCs w:val="20"/>
               </w:rPr>
-              <w:t xml:space="preserve"> optimisation et innovation des parcours de production.</w:t>
+              <w:t xml:space="preserve">organisation de la production et amélioration continue.</w:t>
             </w:r>
           </w:p>
           <w:p>
@@ -1256,21 +1256,21 @@
                 <w:sz w:val="20"/>
                 <w:szCs w:val="20"/>
               </w:rPr>
-              <w:t xml:space="preserve">Prise de participation majoritaire ou totale | Accompagnement court </w:t>
-            </w:r>
-            <w:r>
-              <w:rPr>
-                <w:sz w:val="20"/>
-                <w:szCs w:val="20"/>
-              </w:rPr>
-              <w:t xml:space="preserve">(3 à 6 mois) </w:t>
-            </w:r>
-            <w:r>
-              <w:rPr>
-                <w:sz w:val="20"/>
-                <w:szCs w:val="20"/>
-              </w:rPr>
-              <w:t>par le cédant.</w:t>
+              <w:t xml:space="preserve">Prise de participation majoritaire ou totale | Transition accompagnée avec le cédant (idéalement 3 à 6 mois, à adapter selon les besoins de l’entreprise et du cédant).</w:t>
+            </w:r>
+            <w:r>
+              <w:rPr>
+                <w:sz w:val="20"/>
+                <w:szCs w:val="20"/>
+              </w:rPr>
+              <w:t xml:space="preserve"/>
+            </w:r>
+            <w:r>
+              <w:rPr>
+                <w:sz w:val="20"/>
+                <w:szCs w:val="20"/>
+              </w:rPr>
+              <w:t/>
             </w:r>
           </w:p>
           <w:p>
@@ -1295,7 +1295,7 @@
                 <w:sz w:val="20"/>
                 <w:szCs w:val="20"/>
               </w:rPr>
-              <w:t>Équipe de conseils : cabinet d’expertise comptable et d’avocat, réseau CRA / CCRE. Une équipe de repreneurs déjà identifiée.</w:t>
+              <w:t>Équipe de conseils : cabinet d’expertise comptable et d’avocat, réseau CRA / CCRE. Je reprendrai l’entreprise en tant que dirigeant, accompagné d’associés financiers déjà identifiés.</w:t>
             </w:r>
             <w:r>
               <w:rPr>
@@ -1397,7 +1397,7 @@
           <w:sz w:val="20"/>
           <w:szCs w:val="20"/>
         </w:rPr>
-        <w:t xml:space="preserve"> Ouverture et pilotage d'agence, gestion complète de P&amp;L (jusqu'à 2 M€).</w:t>
+        <w:t xml:space="preserve"> Ouverture et pilotage d'agence, gestion complète du compte de résultat (jusqu'à 2 M€).</w:t>
       </w:r>
     </w:p>
     <w:p>
@@ -1421,14 +1421,14 @@
           <w:sz w:val="20"/>
           <w:szCs w:val="20"/>
         </w:rPr>
-        <w:t>Management &amp; Orga :</w:t>
+        <w:t>Management et organisation :</w:t>
       </w:r>
       <w:r>
         <w:rPr>
           <w:sz w:val="20"/>
           <w:szCs w:val="20"/>
         </w:rPr>
-        <w:t xml:space="preserve"> Direction d'équipes pluridisciplinaires (jusqu'à 50 coll.), Pilotage de la stratégie (SI, PMO, conduite du changement).</w:t>
+        <w:t xml:space="preserve"> Direction d’équipes pluridisciplinaires (jusqu’à 50 collaborateurs), pilotage de l’organisation, des systèmes d’information et des projets.</w:t>
       </w:r>
     </w:p>
     <w:p>
@@ -1467,7 +1467,7 @@
           <w:sz w:val="20"/>
           <w:szCs w:val="20"/>
         </w:rPr>
-        <w:t>BtoB</w:t>
+        <w:t>auprès des entreprises</w:t>
       </w:r>
       <w:proofErr w:type="spellEnd"/>
       <w:r>
@@ -1475,7 +1475,7 @@
           <w:sz w:val="20"/>
           <w:szCs w:val="20"/>
         </w:rPr>
-        <w:t>/BtoC, prospection, réponse aux appels d'offres, fidélisation de clients.</w:t>
+        <w:t xml:space="preserve"> et des particuliers, prospection, réponse aux appels d'offres, fidélisation de clients.</w:t>
       </w:r>
     </w:p>
     <w:p>
@@ -1506,7 +1506,7 @@
           <w:sz w:val="20"/>
           <w:szCs w:val="20"/>
         </w:rPr>
-        <w:t xml:space="preserve"> formation CCRE — Club des Créateurs et Repreneurs d’Entreprise de l’EM Lyon | Mastère Spécialisé Management et Développement des SI (EM Lyon/Centrale - 2008) | Diplôme Marketing et Management Européen (IDRAC - 2004).</w:t>
+        <w:t xml:space="preserve"> formation CCRE — Club des Créateurs et Repreneurs d’Entreprise de l’EM Lyon | Mastère spécialisé Management et développement des systèmes d’information (EM Lyon/Centrale - 2008) | Diplôme Marketing et Management Européen (IDRAC - 2004).</w:t>
       </w:r>
     </w:p>
     <w:p>
@@ -1608,7 +1608,7 @@
         <w:t>Missions :</w:t>
       </w:r>
       <w:r>
-        <w:t xml:space="preserve"> Ouverture de l'agence lyonnaise, gestion du P&amp;L, recrutement et management (jusqu'à 50 collaborateurs). Développement de la stratégie commerciale, réponse aux appels d'offres (public et privé). Pilotage de l’offre conseil au niveau national.</w:t>
+        <w:t xml:space="preserve"> Ouverture de l'agence lyonnaise, gestion du compte de résultat, recrutement et management (jusqu'à 50 collaborateurs). Développement de la stratégie commerciale, réponse aux appels d'offres (public et privé). Pilotage de l’offre conseil au niveau national.</w:t>
       </w:r>
     </w:p>
     <w:p>
@@ -1641,7 +1641,7 @@
       </w:r>
       <w:proofErr w:type="spellEnd"/>
       <w:r>
-        <w:t>). Structuration des offres de conseil (Stratégie SI, Organisation, PMO).</w:t>
+        <w:t>). Structuration des offres de conseil : stratégie des systèmes d’information, organisation et pilotage de projets.</w:t>
       </w:r>
     </w:p>
     <w:p>
@@ -1699,7 +1699,7 @@
         <w:t>Missions :</w:t>
       </w:r>
       <w:r>
-        <w:t xml:space="preserve"> Prospection, développement commercial et gestion d'un P&amp;L (2 M€).</w:t>
+        <w:t xml:space="preserve"> Prospection, développement commercial et gestion d’un compte de résultat (2 M€).</w:t>
       </w:r>
     </w:p>
     <w:p>
@@ -1764,7 +1764,7 @@
         <w:t>Missions :</w:t>
       </w:r>
       <w:r>
-        <w:t xml:space="preserve"> Accompagnement stratégique, AMOE et AMOA pour de grands comptes.</w:t>
+        <w:t xml:space="preserve"> Accompagnement stratégique et pilotage de grands projets informatiques et organisationnels pour de grands comptes.</w:t>
       </w:r>
     </w:p>
     <w:p>
@@ -1789,7 +1789,7 @@
         <w:t>Réalisations :</w:t>
       </w:r>
       <w:r>
-        <w:t xml:space="preserve"> Mise en place d'outils de gestion de portefeuilles de projets (PPM) pour EDF. Pilotage de la stratégie documentaire pour Renault Trucks.</w:t>
+        <w:t xml:space="preserve"> Mise en place d’outils de pilotage de l’activité pour EDF. Suivi documentaire des projets pour Renault Trucks.</w:t>
       </w:r>
     </w:p>
     <w:p>
@@ -1854,12 +1854,12 @@
         <w:t>Réalisations :</w:t>
       </w:r>
       <w:r>
-        <w:t xml:space="preserve"> Suivi financier (P&amp;L). Création et gestion du système d'information complet pour les 40 agences de la franchise.</w:t>
+        <w:t xml:space="preserve"> Suivi du compte de résultat. Création et gestion du système d'information complet pour les 40 agences de la franchise.</w:t>
       </w:r>
     </w:p>
     <w:sectPr>
       <w:pgSz w:w="12240" w:h="15840"/>
-      <w:pgMar w:top="1134" w:right="1077" w:bottom="1134" w:left="1077" w:header="0" w:footer="720" w:gutter="0"/>
+      <w:pgMar w:top="860" w:right="1077" w:bottom="700" w:left="1077" w:header="0" w:footer="0" w:gutter="0"/>
       <w:pgNumType w:start="1"/>
       <w:cols w:space="720"/>
       <w:docGrid w:linePitch="299"/>

</xml_diff>